<commit_message>
Add portfolio link and REDCap project to Premier resume
</commit_message>
<xml_diff>
--- a/output/cv-alanis-sun-premier-research-project-manager-ii-r6892-2026-09-28.docx
+++ b/output/cv-alanis-sun-premier-research-project-manager-ii-r6892-2026-09-28.docx
@@ -1,6 +1,6 @@
 
 <file path=word/document.xml><?xml version="1.0" encoding="utf-8"?>
-<w:document xmlns:w="http://schemas.openxmlformats.org/wordprocessingml/2006/main">
+<w:document xmlns:r="http://schemas.openxmlformats.org/officeDocument/2006/relationships" xmlns:w="http://schemas.openxmlformats.org/wordprocessingml/2006/main">
   <w:body>
     <w:p>
       <w:pPr>
@@ -15,7 +15,24 @@
         <w:pStyle w:val="Normal"/>
       </w:pPr>
       <w:r>
-        <w:t>Cocoa, FL | 321-750-7281 | yushuangsun36@gmail.com | US Permanent Resident | Bilingual: English and Mandarin Chinese</w:t>
+        <w:t xml:space="preserve">Cocoa, FL | 321-750-7281 | yushuangsun36@gmail.com | </w:t>
+      </w:r>
+      <w:hyperlink r:id="rId3">
+        <w:r>
+          <w:rPr>
+            <w:color w:val="0563C1"/>
+            <w:u w:val="single"/>
+          </w:rPr>
+          <w:t>GitHub Portfolio</w:t>
+        </w:r>
+      </w:hyperlink>
+    </w:p>
+    <w:p>
+      <w:pPr>
+        <w:pStyle w:val="Normal"/>
+      </w:pPr>
+      <w:r>
+        <w:t>US Permanent Resident | Bilingual: English and Mandarin Chinese</w:t>
       </w:r>
     </w:p>
     <w:p>
@@ -171,7 +188,7 @@
         <w:pStyle w:val="Heading1"/>
       </w:pPr>
       <w:r>
-        <w:t>Independent Project</w:t>
+        <w:t>Independent Projects</w:t>
       </w:r>
     </w:p>
     <w:p>
@@ -186,6 +203,20 @@
       </w:r>
       <w:r>
         <w:t xml:space="preserve"> Developed a Phase I study timeline and milestone tracker covering dependencies, baseline/forecast variance, delivery health, cross-functional RACI, and governance/escalation workflows.</w:t>
+      </w:r>
+    </w:p>
+    <w:p>
+      <w:pPr>
+        <w:pStyle w:val="ListBullet"/>
+      </w:pPr>
+      <w:r>
+        <w:rPr>
+          <w:b/>
+        </w:rPr>
+        <w:t>Clinical Trial REDCap Simulation:</w:t>
+      </w:r>
+      <w:r>
+        <w:t xml:space="preserve"> Designed a Phase I EDC simulation with longitudinal CRFs, visit mapping, clinical-sample traceability, data-quality controls, and role-based access concepts.</w:t>
       </w:r>
     </w:p>
     <w:p>

</xml_diff>